<commit_message>
Finalize project documentation and presentation
</commit_message>
<xml_diff>
--- a/Mutual Fund Analytics Platform.docx
+++ b/Mutual Fund Analytics Platform.docx
@@ -61,13 +61,7 @@
         <w:t>Tools Used:</w:t>
       </w:r>
       <w:r>
-        <w:t xml:space="preserve"> Python, Pandas, NumPy, SQLite, </w:t>
-      </w:r>
-      <w:r>
-        <w:t>SQL Alchemy</w:t>
-      </w:r>
-      <w:r>
-        <w:t>, Jupyter Notebook, Power BI, Git, GitHub</w:t>
+        <w:t xml:space="preserve"> Python, Pandas, NumPy, SQLite, SQL Alchemy, Jupyter Notebook, Power BI, Git, GitHub</w:t>
       </w:r>
       <w:r>
         <w:br/>
@@ -99,7 +93,7 @@
     <w:p>
       <w:r>
         <w:pict w14:anchorId="0354C0B9">
-          <v:rect id="_x0000_i1163" style="width:0;height:1.5pt" o:hralign="center" o:hrstd="t" o:hr="t" fillcolor="#a0a0a0" stroked="f"/>
+          <v:rect id="_x0000_i1025" style="width:0;height:1.5pt" o:hralign="center" o:hrstd="t" o:hr="t" fillcolor="#a0a0a0" stroked="f"/>
         </w:pict>
       </w:r>
     </w:p>
@@ -131,13 +125,7 @@
     </w:p>
     <w:p>
       <w:r>
-        <w:t xml:space="preserve">The platform processes ten mutual fund datasets containing fund metadata, NAV history, investor transactions, AUM information, portfolio holdings, and benchmark data. Through ETL pipelines, data quality validation, database </w:t>
-      </w:r>
-      <w:r>
-        <w:t>modelling</w:t>
-      </w:r>
-      <w:r>
-        <w:t>, and analytical reporting, the project provides actionable insights for investors, fund managers, and financial institutions.</w:t>
+        <w:t>The platform processes ten mutual fund datasets containing fund metadata, NAV history, investor transactions, AUM information, portfolio holdings, and benchmark data. Through ETL pipelines, data quality validation, database modelling, and analytical reporting, the project provides actionable insights for investors, fund managers, and financial institutions.</w:t>
       </w:r>
     </w:p>
     <w:p>
@@ -148,7 +136,7 @@
     <w:p>
       <w:r>
         <w:pict w14:anchorId="65723825">
-          <v:rect id="_x0000_i1164" style="width:0;height:1.5pt" o:hralign="center" o:hrstd="t" o:hr="t" fillcolor="#a0a0a0" stroked="f"/>
+          <v:rect id="_x0000_i1026" style="width:0;height:1.5pt" o:hralign="center" o:hrstd="t" o:hr="t" fillcolor="#a0a0a0" stroked="f"/>
         </w:pict>
       </w:r>
     </w:p>
@@ -206,13 +194,7 @@
         </w:numPr>
       </w:pPr>
       <w:r>
-        <w:t xml:space="preserve">Evaluate investor </w:t>
-      </w:r>
-      <w:r>
-        <w:t>behaviour</w:t>
-      </w:r>
-      <w:r>
-        <w:t xml:space="preserve"> and transaction patterns.</w:t>
+        <w:t>Evaluate investor behaviour and transaction patterns.</w:t>
       </w:r>
     </w:p>
     <w:p>
@@ -355,7 +337,7 @@
     <w:p>
       <w:r>
         <w:pict w14:anchorId="69E0D376">
-          <v:rect id="_x0000_i1165" style="width:0;height:1.5pt" o:hralign="center" o:hrstd="t" o:hr="t" fillcolor="#a0a0a0" stroked="f"/>
+          <v:rect id="_x0000_i1027" style="width:0;height:1.5pt" o:hralign="center" o:hrstd="t" o:hr="t" fillcolor="#a0a0a0" stroked="f"/>
         </w:pict>
       </w:r>
     </w:p>
@@ -764,7 +746,7 @@
     <w:p>
       <w:r>
         <w:pict w14:anchorId="711D358C">
-          <v:rect id="_x0000_i1166" style="width:0;height:1.5pt" o:hralign="center" o:hrstd="t" o:hr="t" fillcolor="#a0a0a0" stroked="f"/>
+          <v:rect id="_x0000_i1028" style="width:0;height:1.5pt" o:hralign="center" o:hrstd="t" o:hr="t" fillcolor="#a0a0a0" stroked="f"/>
         </w:pict>
       </w:r>
     </w:p>
@@ -980,7 +962,7 @@
     <w:p>
       <w:r>
         <w:pict w14:anchorId="089C3A58">
-          <v:rect id="_x0000_i1167" style="width:0;height:1.5pt" o:hralign="center" o:hrstd="t" o:hr="t" fillcolor="#a0a0a0" stroked="f"/>
+          <v:rect id="_x0000_i1029" style="width:0;height:1.5pt" o:hralign="center" o:hrstd="t" o:hr="t" fillcolor="#a0a0a0" stroked="f"/>
         </w:pict>
       </w:r>
     </w:p>
@@ -1275,7 +1257,7 @@
     <w:p>
       <w:r>
         <w:pict w14:anchorId="6C76E675">
-          <v:rect id="_x0000_i1168" style="width:0;height:1.5pt" o:hralign="center" o:hrstd="t" o:hr="t" fillcolor="#a0a0a0" stroked="f"/>
+          <v:rect id="_x0000_i1030" style="width:0;height:1.5pt" o:hralign="center" o:hrstd="t" o:hr="t" fillcolor="#a0a0a0" stroked="f"/>
         </w:pict>
       </w:r>
     </w:p>
@@ -1358,7 +1340,7 @@
         </w:rPr>
         <w:lastRenderedPageBreak/>
         <w:drawing>
-          <wp:inline distT="0" distB="0" distL="0" distR="0" wp14:anchorId="4FF651CB" wp14:editId="6FC34E77">
+          <wp:inline distT="0" distB="0" distL="0" distR="0" wp14:anchorId="4FF651CB" wp14:editId="1DDC0F20">
             <wp:extent cx="5727700" cy="3448050"/>
             <wp:effectExtent l="0" t="0" r="6350" b="0"/>
             <wp:docPr id="332994824" name="Picture 1"/>
@@ -1413,7 +1395,7 @@
     <w:p>
       <w:r>
         <w:pict w14:anchorId="287401F4">
-          <v:rect id="_x0000_i1169" style="width:0;height:1.5pt" o:hralign="center" o:hrstd="t" o:hr="t" fillcolor="#a0a0a0" stroked="f"/>
+          <v:rect id="_x0000_i1031" style="width:0;height:1.5pt" o:hralign="center" o:hrstd="t" o:hr="t" fillcolor="#a0a0a0" stroked="f"/>
         </w:pict>
       </w:r>
     </w:p>
@@ -1462,7 +1444,7 @@
     <w:p>
       <w:r>
         <w:pict w14:anchorId="057BB367">
-          <v:rect id="_x0000_i1170" style="width:0;height:1.5pt" o:hralign="center" o:hrstd="t" o:hr="t" fillcolor="#a0a0a0" stroked="f"/>
+          <v:rect id="_x0000_i1032" style="width:0;height:1.5pt" o:hralign="center" o:hrstd="t" o:hr="t" fillcolor="#a0a0a0" stroked="f"/>
         </w:pict>
       </w:r>
     </w:p>
@@ -1530,7 +1512,7 @@
         </w:rPr>
         <w:lastRenderedPageBreak/>
         <w:drawing>
-          <wp:inline distT="0" distB="0" distL="0" distR="0" wp14:anchorId="2BEEBC7E" wp14:editId="2DF6CA80">
+          <wp:inline distT="0" distB="0" distL="0" distR="0" wp14:anchorId="2BEEBC7E" wp14:editId="401C6F06">
             <wp:extent cx="5721350" cy="3371850"/>
             <wp:effectExtent l="0" t="0" r="0" b="0"/>
             <wp:docPr id="30891991" name="Picture 2"/>
@@ -1582,7 +1564,7 @@
     <w:p>
       <w:r>
         <w:pict w14:anchorId="759E2E03">
-          <v:rect id="_x0000_i1171" style="width:0;height:1.5pt" o:hralign="center" o:hrstd="t" o:hr="t" fillcolor="#a0a0a0" stroked="f"/>
+          <v:rect id="_x0000_i1033" style="width:0;height:1.5pt" o:hralign="center" o:hrstd="t" o:hr="t" fillcolor="#a0a0a0" stroked="f"/>
         </w:pict>
       </w:r>
     </w:p>
@@ -1634,7 +1616,7 @@
           <w:noProof/>
         </w:rPr>
         <w:drawing>
-          <wp:inline distT="0" distB="0" distL="0" distR="0" wp14:anchorId="4C9EE999" wp14:editId="3E17B13A">
+          <wp:inline distT="0" distB="0" distL="0" distR="0" wp14:anchorId="4C9EE999" wp14:editId="782F0D41">
             <wp:extent cx="4755273" cy="2825750"/>
             <wp:effectExtent l="0" t="0" r="7620" b="0"/>
             <wp:docPr id="1413541117" name="Picture 3"/>
@@ -1686,7 +1668,7 @@
     <w:p>
       <w:r>
         <w:pict w14:anchorId="505820C0">
-          <v:rect id="_x0000_i1172" style="width:0;height:1.5pt" o:hralign="center" o:hrstd="t" o:hr="t" fillcolor="#a0a0a0" stroked="f"/>
+          <v:rect id="_x0000_i1034" style="width:0;height:1.5pt" o:hralign="center" o:hrstd="t" o:hr="t" fillcolor="#a0a0a0" stroked="f"/>
         </w:pict>
       </w:r>
     </w:p>
@@ -1795,7 +1777,7 @@
           <w:noProof/>
         </w:rPr>
         <w:drawing>
-          <wp:inline distT="0" distB="0" distL="0" distR="0" wp14:anchorId="2ED46670" wp14:editId="6F1BE0C6">
+          <wp:inline distT="0" distB="0" distL="0" distR="0" wp14:anchorId="2ED46670" wp14:editId="73A76733">
             <wp:extent cx="5727700" cy="3403600"/>
             <wp:effectExtent l="0" t="0" r="6350" b="6350"/>
             <wp:docPr id="490964186" name="Picture 4"/>
@@ -1847,7 +1829,7 @@
     <w:p>
       <w:r>
         <w:pict w14:anchorId="5FED42BC">
-          <v:rect id="_x0000_i1173" style="width:0;height:1.5pt" o:hralign="center" o:hrstd="t" o:hr="t" fillcolor="#a0a0a0" stroked="f"/>
+          <v:rect id="_x0000_i1035" style="width:0;height:1.5pt" o:hralign="center" o:hrstd="t" o:hr="t" fillcolor="#a0a0a0" stroked="f"/>
         </w:pict>
       </w:r>
     </w:p>
@@ -1958,7 +1940,7 @@
     <w:p>
       <w:r>
         <w:pict w14:anchorId="2C261019">
-          <v:rect id="_x0000_i1174" style="width:0;height:1.5pt" o:hralign="center" o:hrstd="t" o:hr="t" fillcolor="#a0a0a0" stroked="f"/>
+          <v:rect id="_x0000_i1036" style="width:0;height:1.5pt" o:hralign="center" o:hrstd="t" o:hr="t" fillcolor="#a0a0a0" stroked="f"/>
         </w:pict>
       </w:r>
     </w:p>
@@ -2049,7 +2031,7 @@
     <w:p>
       <w:r>
         <w:pict w14:anchorId="4B4454D7">
-          <v:rect id="_x0000_i1175" style="width:0;height:1.5pt" o:hralign="center" o:hrstd="t" o:hr="t" fillcolor="#a0a0a0" stroked="f"/>
+          <v:rect id="_x0000_i1037" style="width:0;height:1.5pt" o:hralign="center" o:hrstd="t" o:hr="t" fillcolor="#a0a0a0" stroked="f"/>
         </w:pict>
       </w:r>
     </w:p>
@@ -2103,7 +2085,7 @@
     <w:p>
       <w:r>
         <w:pict w14:anchorId="17779A11">
-          <v:rect id="_x0000_i1176" style="width:0;height:1.5pt" o:hralign="center" o:hrstd="t" o:hr="t" fillcolor="#a0a0a0" stroked="f"/>
+          <v:rect id="_x0000_i1038" style="width:0;height:1.5pt" o:hralign="center" o:hrstd="t" o:hr="t" fillcolor="#a0a0a0" stroked="f"/>
         </w:pict>
       </w:r>
     </w:p>
@@ -2208,7 +2190,7 @@
       <w:r>
         <w:lastRenderedPageBreak/>
         <w:pict w14:anchorId="625E4F79">
-          <v:rect id="_x0000_i1177" style="width:0;height:1.5pt" o:hralign="center" o:hrstd="t" o:hr="t" fillcolor="#a0a0a0" stroked="f"/>
+          <v:rect id="_x0000_i1039" style="width:0;height:1.5pt" o:hralign="center" o:hrstd="t" o:hr="t" fillcolor="#a0a0a0" stroked="f"/>
         </w:pict>
       </w:r>
     </w:p>
@@ -2345,7 +2327,7 @@
     <w:p>
       <w:r>
         <w:pict w14:anchorId="571BB1DE">
-          <v:rect id="_x0000_i1178" style="width:0;height:1.5pt" o:hralign="center" o:hrstd="t" o:hr="t" fillcolor="#a0a0a0" stroked="f"/>
+          <v:rect id="_x0000_i1040" style="width:0;height:1.5pt" o:hralign="center" o:hrstd="t" o:hr="t" fillcolor="#a0a0a0" stroked="f"/>
         </w:pict>
       </w:r>
     </w:p>
@@ -2389,11 +2371,6 @@
       </w:pPr>
       <w:r>
         <w:t>At-risk investors identified through transaction gap analysis.</w:t>
-      </w:r>
-    </w:p>
-    <w:p>
-      <w:r>
-        <w:t>(Insert SIP Continuity Dashboard)</w:t>
       </w:r>
     </w:p>
     <w:p/>
@@ -2401,7 +2378,7 @@
     <w:p>
       <w:r>
         <w:pict w14:anchorId="5C83747A">
-          <v:rect id="_x0000_i1179" style="width:0;height:1.5pt" o:hralign="center" o:hrstd="t" o:hr="t" fillcolor="#a0a0a0" stroked="f"/>
+          <v:rect id="_x0000_i1041" style="width:0;height:1.5pt" o:hralign="center" o:hrstd="t" o:hr="t" fillcolor="#a0a0a0" stroked="f"/>
         </w:pict>
       </w:r>
     </w:p>
@@ -2544,7 +2521,7 @@
     <w:p>
       <w:r>
         <w:pict w14:anchorId="3A185C90">
-          <v:rect id="_x0000_i1180" style="width:0;height:1.5pt" o:hralign="center" o:hrstd="t" o:hr="t" fillcolor="#a0a0a0" stroked="f"/>
+          <v:rect id="_x0000_i1042" style="width:0;height:1.5pt" o:hralign="center" o:hrstd="t" o:hr="t" fillcolor="#a0a0a0" stroked="f"/>
         </w:pict>
       </w:r>
     </w:p>
@@ -2656,16 +2633,472 @@
     </w:p>
     <w:p>
       <w:r>
-        <w:t>(Insert Recommendation Output Screenshot)</w:t>
+        <w:lastRenderedPageBreak/>
+        <w:drawing>
+          <wp:inline distT="0" distB="0" distL="0" distR="0" wp14:anchorId="0A49C1D3" wp14:editId="4A9D78F2">
+            <wp:extent cx="5493032" cy="2578233"/>
+            <wp:effectExtent l="0" t="0" r="0" b="0"/>
+            <wp:docPr id="1112260571" name="Picture 1"/>
+            <wp:cNvGraphicFramePr>
+              <a:graphicFrameLocks xmlns:a="http://schemas.openxmlformats.org/drawingml/2006/main" noChangeAspect="1"/>
+            </wp:cNvGraphicFramePr>
+            <a:graphic xmlns:a="http://schemas.openxmlformats.org/drawingml/2006/main">
+              <a:graphicData uri="http://schemas.openxmlformats.org/drawingml/2006/picture">
+                <pic:pic xmlns:pic="http://schemas.openxmlformats.org/drawingml/2006/picture">
+                  <pic:nvPicPr>
+                    <pic:cNvPr id="1112260571" name=""/>
+                    <pic:cNvPicPr/>
+                  </pic:nvPicPr>
+                  <pic:blipFill>
+                    <a:blip r:embed="rId13"/>
+                    <a:stretch>
+                      <a:fillRect/>
+                    </a:stretch>
+                  </pic:blipFill>
+                  <pic:spPr>
+                    <a:xfrm>
+                      <a:off x="0" y="0"/>
+                      <a:ext cx="5493032" cy="2578233"/>
+                    </a:xfrm>
+                    <a:prstGeom prst="rect">
+                      <a:avLst/>
+                    </a:prstGeom>
+                  </pic:spPr>
+                </pic:pic>
+              </a:graphicData>
+            </a:graphic>
+          </wp:inline>
+        </w:drawing>
       </w:r>
     </w:p>
     <w:p/>
     <w:p/>
+    <w:p>
+      <w:r>
+        <w:pict w14:anchorId="53A3DDE6">
+          <v:rect id="_x0000_i1043" style="width:0;height:1.5pt" o:hralign="center" o:hrstd="t" o:hr="t" fillcolor="#a0a0a0" stroked="f"/>
+        </w:pict>
+      </w:r>
+    </w:p>
+    <w:p>
+      <w:pPr>
+        <w:rPr>
+          <w:b/>
+          <w:bCs/>
+        </w:rPr>
+      </w:pPr>
+      <w:r>
+        <w:rPr>
+          <w:b/>
+          <w:bCs/>
+        </w:rPr>
+        <w:t>11. Dashboard Overview</w:t>
+      </w:r>
+    </w:p>
+    <w:p>
+      <w:pPr>
+        <w:rPr>
+          <w:b/>
+          <w:bCs/>
+        </w:rPr>
+      </w:pPr>
+      <w:r>
+        <w:rPr>
+          <w:b/>
+          <w:bCs/>
+        </w:rPr>
+        <w:t>Dashboard Components</w:t>
+      </w:r>
+    </w:p>
+    <w:p>
+      <w:pPr>
+        <w:numPr>
+          <w:ilvl w:val="0"/>
+          <w:numId w:val="24"/>
+        </w:numPr>
+      </w:pPr>
+      <w:r>
+        <w:t>Executive Summary</w:t>
+      </w:r>
+    </w:p>
+    <w:p>
+      <w:pPr>
+        <w:numPr>
+          <w:ilvl w:val="0"/>
+          <w:numId w:val="24"/>
+        </w:numPr>
+      </w:pPr>
+      <w:r>
+        <w:t>Investor Analytics</w:t>
+      </w:r>
+    </w:p>
+    <w:p>
+      <w:pPr>
+        <w:numPr>
+          <w:ilvl w:val="0"/>
+          <w:numId w:val="24"/>
+        </w:numPr>
+      </w:pPr>
+      <w:r>
+        <w:t>Fund Performance</w:t>
+      </w:r>
+    </w:p>
+    <w:p>
+      <w:pPr>
+        <w:numPr>
+          <w:ilvl w:val="0"/>
+          <w:numId w:val="24"/>
+        </w:numPr>
+      </w:pPr>
+      <w:r>
+        <w:t>Risk Analytics</w:t>
+      </w:r>
+    </w:p>
+    <w:p>
+      <w:pPr>
+        <w:numPr>
+          <w:ilvl w:val="0"/>
+          <w:numId w:val="24"/>
+        </w:numPr>
+      </w:pPr>
+      <w:r>
+        <w:t>Portfolio Concentration</w:t>
+      </w:r>
+    </w:p>
+    <w:p>
+      <w:pPr>
+        <w:numPr>
+          <w:ilvl w:val="0"/>
+          <w:numId w:val="24"/>
+        </w:numPr>
+      </w:pPr>
+      <w:r>
+        <w:t>Geographic Analysis</w:t>
+      </w:r>
+    </w:p>
+    <w:p>
+      <w:r>
+        <w:t>Screenshot 1: Overview Dashboard</w:t>
+      </w:r>
+    </w:p>
+    <w:p>
+      <w:r>
+        <w:rPr>
+          <w:noProof/>
+        </w:rPr>
+        <w:drawing>
+          <wp:inline distT="0" distB="0" distL="0" distR="0" wp14:anchorId="0A5FFB5B" wp14:editId="490166EF">
+            <wp:extent cx="5033010" cy="2577285"/>
+            <wp:effectExtent l="0" t="0" r="0" b="0"/>
+            <wp:docPr id="1947461220" name="Picture 1"/>
+            <wp:cNvGraphicFramePr>
+              <a:graphicFrameLocks xmlns:a="http://schemas.openxmlformats.org/drawingml/2006/main" noChangeAspect="1"/>
+            </wp:cNvGraphicFramePr>
+            <a:graphic xmlns:a="http://schemas.openxmlformats.org/drawingml/2006/main">
+              <a:graphicData uri="http://schemas.openxmlformats.org/drawingml/2006/picture">
+                <pic:pic xmlns:pic="http://schemas.openxmlformats.org/drawingml/2006/picture">
+                  <pic:nvPicPr>
+                    <pic:cNvPr id="1947461220" name="Picture 1947461220"/>
+                    <pic:cNvPicPr/>
+                  </pic:nvPicPr>
+                  <pic:blipFill>
+                    <a:blip r:embed="rId14" cstate="print">
+                      <a:extLst>
+                        <a:ext uri="{28A0092B-C50C-407E-A947-70E740481C1C}">
+                          <a14:useLocalDpi xmlns:a14="http://schemas.microsoft.com/office/drawing/2010/main" val="0"/>
+                        </a:ext>
+                      </a:extLst>
+                    </a:blip>
+                    <a:stretch>
+                      <a:fillRect/>
+                    </a:stretch>
+                  </pic:blipFill>
+                  <pic:spPr>
+                    <a:xfrm>
+                      <a:off x="0" y="0"/>
+                      <a:ext cx="5041174" cy="2581466"/>
+                    </a:xfrm>
+                    <a:prstGeom prst="rect">
+                      <a:avLst/>
+                    </a:prstGeom>
+                  </pic:spPr>
+                </pic:pic>
+              </a:graphicData>
+            </a:graphic>
+          </wp:inline>
+        </w:drawing>
+      </w:r>
+    </w:p>
+    <w:p>
+      <w:r>
+        <w:lastRenderedPageBreak/>
+        <w:t>Screenshot 2: Investor Analytics Dashboard</w:t>
+      </w:r>
+    </w:p>
+    <w:p>
+      <w:r>
+        <w:drawing>
+          <wp:inline distT="0" distB="0" distL="0" distR="0" wp14:anchorId="6EE2A5A8" wp14:editId="6F7DB1B5">
+            <wp:extent cx="5731510" cy="3134995"/>
+            <wp:effectExtent l="0" t="0" r="2540" b="8255"/>
+            <wp:docPr id="1669727376" name="Picture 1"/>
+            <wp:cNvGraphicFramePr>
+              <a:graphicFrameLocks xmlns:a="http://schemas.openxmlformats.org/drawingml/2006/main" noChangeAspect="1"/>
+            </wp:cNvGraphicFramePr>
+            <a:graphic xmlns:a="http://schemas.openxmlformats.org/drawingml/2006/main">
+              <a:graphicData uri="http://schemas.openxmlformats.org/drawingml/2006/picture">
+                <pic:pic xmlns:pic="http://schemas.openxmlformats.org/drawingml/2006/picture">
+                  <pic:nvPicPr>
+                    <pic:cNvPr id="1669727376" name=""/>
+                    <pic:cNvPicPr/>
+                  </pic:nvPicPr>
+                  <pic:blipFill>
+                    <a:blip r:embed="rId15"/>
+                    <a:stretch>
+                      <a:fillRect/>
+                    </a:stretch>
+                  </pic:blipFill>
+                  <pic:spPr>
+                    <a:xfrm>
+                      <a:off x="0" y="0"/>
+                      <a:ext cx="5731510" cy="3134995"/>
+                    </a:xfrm>
+                    <a:prstGeom prst="rect">
+                      <a:avLst/>
+                    </a:prstGeom>
+                  </pic:spPr>
+                </pic:pic>
+              </a:graphicData>
+            </a:graphic>
+          </wp:inline>
+        </w:drawing>
+      </w:r>
+    </w:p>
     <w:p/>
     <w:p>
       <w:r>
-        <w:pict w14:anchorId="53A3DDE6">
-          <v:rect id="_x0000_i1181" style="width:0;height:1.5pt" o:hralign="center" o:hrstd="t" o:hr="t" fillcolor="#a0a0a0" stroked="f"/>
+        <w:t>Screenshot 3: Risk Analytics Dashboard</w:t>
+      </w:r>
+    </w:p>
+    <w:p>
+      <w:r>
+        <w:drawing>
+          <wp:inline distT="0" distB="0" distL="0" distR="0" wp14:anchorId="5FDF90E0" wp14:editId="6445EB1C">
+            <wp:extent cx="5731510" cy="1310640"/>
+            <wp:effectExtent l="0" t="0" r="2540" b="3810"/>
+            <wp:docPr id="932807713" name="Picture 1"/>
+            <wp:cNvGraphicFramePr>
+              <a:graphicFrameLocks xmlns:a="http://schemas.openxmlformats.org/drawingml/2006/main" noChangeAspect="1"/>
+            </wp:cNvGraphicFramePr>
+            <a:graphic xmlns:a="http://schemas.openxmlformats.org/drawingml/2006/main">
+              <a:graphicData uri="http://schemas.openxmlformats.org/drawingml/2006/picture">
+                <pic:pic xmlns:pic="http://schemas.openxmlformats.org/drawingml/2006/picture">
+                  <pic:nvPicPr>
+                    <pic:cNvPr id="932807713" name=""/>
+                    <pic:cNvPicPr/>
+                  </pic:nvPicPr>
+                  <pic:blipFill>
+                    <a:blip r:embed="rId16"/>
+                    <a:stretch>
+                      <a:fillRect/>
+                    </a:stretch>
+                  </pic:blipFill>
+                  <pic:spPr>
+                    <a:xfrm>
+                      <a:off x="0" y="0"/>
+                      <a:ext cx="5731510" cy="1310640"/>
+                    </a:xfrm>
+                    <a:prstGeom prst="rect">
+                      <a:avLst/>
+                    </a:prstGeom>
+                  </pic:spPr>
+                </pic:pic>
+              </a:graphicData>
+            </a:graphic>
+          </wp:inline>
+        </w:drawing>
+      </w:r>
+    </w:p>
+    <w:p>
+      <w:r>
+        <w:t>Screenshot 4: Fund Performance Dashboard</w:t>
+      </w:r>
+    </w:p>
+    <w:p/>
+    <w:p>
+      <w:r>
+        <w:drawing>
+          <wp:inline distT="0" distB="0" distL="0" distR="0" wp14:anchorId="0C2AF809" wp14:editId="6D6CDDDA">
+            <wp:extent cx="5731510" cy="1945640"/>
+            <wp:effectExtent l="0" t="0" r="2540" b="0"/>
+            <wp:docPr id="663108907" name="Picture 1"/>
+            <wp:cNvGraphicFramePr>
+              <a:graphicFrameLocks xmlns:a="http://schemas.openxmlformats.org/drawingml/2006/main" noChangeAspect="1"/>
+            </wp:cNvGraphicFramePr>
+            <a:graphic xmlns:a="http://schemas.openxmlformats.org/drawingml/2006/main">
+              <a:graphicData uri="http://schemas.openxmlformats.org/drawingml/2006/picture">
+                <pic:pic xmlns:pic="http://schemas.openxmlformats.org/drawingml/2006/picture">
+                  <pic:nvPicPr>
+                    <pic:cNvPr id="663108907" name=""/>
+                    <pic:cNvPicPr/>
+                  </pic:nvPicPr>
+                  <pic:blipFill>
+                    <a:blip r:embed="rId17"/>
+                    <a:stretch>
+                      <a:fillRect/>
+                    </a:stretch>
+                  </pic:blipFill>
+                  <pic:spPr>
+                    <a:xfrm>
+                      <a:off x="0" y="0"/>
+                      <a:ext cx="5731510" cy="1945640"/>
+                    </a:xfrm>
+                    <a:prstGeom prst="rect">
+                      <a:avLst/>
+                    </a:prstGeom>
+                  </pic:spPr>
+                </pic:pic>
+              </a:graphicData>
+            </a:graphic>
+          </wp:inline>
+        </w:drawing>
+      </w:r>
+    </w:p>
+    <w:p/>
+    <w:p/>
+    <w:p>
+      <w:pPr>
+        <w:pStyle w:val="ListParagraph"/>
+        <w:numPr>
+          <w:ilvl w:val="0"/>
+          <w:numId w:val="29"/>
+        </w:numPr>
+        <w:rPr>
+          <w:b/>
+          <w:bCs/>
+        </w:rPr>
+      </w:pPr>
+      <w:r>
+        <w:rPr>
+          <w:b/>
+          <w:bCs/>
+        </w:rPr>
+        <w:lastRenderedPageBreak/>
+        <w:t>12. Key Insights</w:t>
+      </w:r>
+    </w:p>
+    <w:p>
+      <w:pPr>
+        <w:rPr>
+          <w:b/>
+          <w:bCs/>
+        </w:rPr>
+      </w:pPr>
+      <w:r>
+        <w:rPr>
+          <w:b/>
+          <w:bCs/>
+        </w:rPr>
+        <w:t>Insight 1</w:t>
+      </w:r>
+    </w:p>
+    <w:p>
+      <w:r>
+        <w:t>Funds with the highest VaR values exhibited significantly larger downside exposure.</w:t>
+      </w:r>
+    </w:p>
+    <w:p>
+      <w:pPr>
+        <w:rPr>
+          <w:b/>
+          <w:bCs/>
+        </w:rPr>
+      </w:pPr>
+      <w:r>
+        <w:rPr>
+          <w:b/>
+          <w:bCs/>
+        </w:rPr>
+        <w:t>Insight 2</w:t>
+      </w:r>
+    </w:p>
+    <w:p>
+      <w:r>
+        <w:t>Recent investor cohorts contribute the largest investment volumes.</w:t>
+      </w:r>
+    </w:p>
+    <w:p>
+      <w:pPr>
+        <w:rPr>
+          <w:b/>
+          <w:bCs/>
+        </w:rPr>
+      </w:pPr>
+      <w:r>
+        <w:rPr>
+          <w:b/>
+          <w:bCs/>
+        </w:rPr>
+        <w:t>Insight 3</w:t>
+      </w:r>
+    </w:p>
+    <w:p>
+      <w:r>
+        <w:t xml:space="preserve">A small group of states account for </w:t>
+      </w:r>
+      <w:proofErr w:type="gramStart"/>
+      <w:r>
+        <w:t>the majority of</w:t>
+      </w:r>
+      <w:proofErr w:type="gramEnd"/>
+      <w:r>
+        <w:t xml:space="preserve"> SIP investments.</w:t>
+      </w:r>
+    </w:p>
+    <w:p>
+      <w:pPr>
+        <w:rPr>
+          <w:b/>
+          <w:bCs/>
+        </w:rPr>
+      </w:pPr>
+      <w:r>
+        <w:rPr>
+          <w:b/>
+          <w:bCs/>
+        </w:rPr>
+        <w:t>Insight 4</w:t>
+      </w:r>
+    </w:p>
+    <w:p>
+      <w:r>
+        <w:t>Higher Sharpe Ratio funds consistently outperform peers on a risk-adjusted basis.</w:t>
+      </w:r>
+    </w:p>
+    <w:p>
+      <w:pPr>
+        <w:rPr>
+          <w:b/>
+          <w:bCs/>
+        </w:rPr>
+      </w:pPr>
+      <w:r>
+        <w:rPr>
+          <w:b/>
+          <w:bCs/>
+        </w:rPr>
+        <w:t>Insight 5</w:t>
+      </w:r>
+    </w:p>
+    <w:p>
+      <w:r>
+        <w:t>Portfolio concentration varies significantly across equity schemes.</w:t>
+      </w:r>
+    </w:p>
+    <w:p>
+      <w:r>
+        <w:pict w14:anchorId="09634F08">
+          <v:rect id="_x0000_i1045" style="width:0;height:1.5pt" o:hralign="center" o:hrstd="t" o:hr="t" fillcolor="#a0a0a0" stroked="f"/>
         </w:pict>
       </w:r>
     </w:p>
@@ -2681,449 +3114,218 @@
           <w:b/>
           <w:bCs/>
         </w:rPr>
+        <w:t>13. Limitations</w:t>
+      </w:r>
+    </w:p>
+    <w:p>
+      <w:pPr>
+        <w:numPr>
+          <w:ilvl w:val="0"/>
+          <w:numId w:val="25"/>
+        </w:numPr>
+      </w:pPr>
+      <w:r>
+        <w:t>Historical performance does not guarantee future returns.</w:t>
+      </w:r>
+    </w:p>
+    <w:p>
+      <w:pPr>
+        <w:numPr>
+          <w:ilvl w:val="0"/>
+          <w:numId w:val="25"/>
+        </w:numPr>
+      </w:pPr>
+      <w:r>
+        <w:t>Limited availability of live market data.</w:t>
+      </w:r>
+    </w:p>
+    <w:p>
+      <w:pPr>
+        <w:numPr>
+          <w:ilvl w:val="0"/>
+          <w:numId w:val="25"/>
+        </w:numPr>
+      </w:pPr>
+      <w:r>
+        <w:t>Simplified recommendation engine.</w:t>
+      </w:r>
+    </w:p>
+    <w:p>
+      <w:pPr>
+        <w:numPr>
+          <w:ilvl w:val="0"/>
+          <w:numId w:val="25"/>
+        </w:numPr>
+      </w:pPr>
+      <w:r>
+        <w:t>Assumed transaction consistency for SIP analysis.</w:t>
+      </w:r>
+    </w:p>
+    <w:p>
+      <w:pPr>
+        <w:numPr>
+          <w:ilvl w:val="0"/>
+          <w:numId w:val="25"/>
+        </w:numPr>
+      </w:pPr>
+      <w:r>
+        <w:t>Portfolio holdings snapshots may not represent real-time allocations.</w:t>
+      </w:r>
+    </w:p>
+    <w:p>
+      <w:r>
+        <w:pict w14:anchorId="41DBA080">
+          <v:rect id="_x0000_i1046" style="width:0;height:1.5pt" o:hralign="center" o:hrstd="t" o:hr="t" fillcolor="#a0a0a0" stroked="f"/>
+        </w:pict>
+      </w:r>
+    </w:p>
+    <w:p>
+      <w:pPr>
+        <w:rPr>
+          <w:b/>
+          <w:bCs/>
+        </w:rPr>
+      </w:pPr>
+      <w:r>
+        <w:rPr>
+          <w:b/>
+          <w:bCs/>
+        </w:rPr>
+        <w:t>14. Recommendations</w:t>
+      </w:r>
+    </w:p>
+    <w:p>
+      <w:pPr>
+        <w:rPr>
+          <w:b/>
+          <w:bCs/>
+        </w:rPr>
+      </w:pPr>
+      <w:r>
+        <w:rPr>
+          <w:b/>
+          <w:bCs/>
+        </w:rPr>
+        <w:t>For Investors</w:t>
+      </w:r>
+    </w:p>
+    <w:p>
+      <w:pPr>
+        <w:numPr>
+          <w:ilvl w:val="0"/>
+          <w:numId w:val="26"/>
+        </w:numPr>
+      </w:pPr>
+      <w:r>
+        <w:t>Focus on risk-adjusted returns rather than absolute returns.</w:t>
+      </w:r>
+    </w:p>
+    <w:p>
+      <w:pPr>
+        <w:numPr>
+          <w:ilvl w:val="0"/>
+          <w:numId w:val="26"/>
+        </w:numPr>
+      </w:pPr>
+      <w:r>
+        <w:t>Maintain SIP discipline for long-term wealth creation.</w:t>
+      </w:r>
+    </w:p>
+    <w:p>
+      <w:pPr>
+        <w:numPr>
+          <w:ilvl w:val="0"/>
+          <w:numId w:val="26"/>
+        </w:numPr>
+      </w:pPr>
+      <w:r>
+        <w:t>Diversify across categories and sectors.</w:t>
+      </w:r>
+    </w:p>
+    <w:p>
+      <w:pPr>
+        <w:rPr>
+          <w:b/>
+          <w:bCs/>
+        </w:rPr>
+      </w:pPr>
+      <w:r>
+        <w:rPr>
+          <w:b/>
+          <w:bCs/>
+        </w:rPr>
+        <w:t>For Fund Houses</w:t>
+      </w:r>
+    </w:p>
+    <w:p>
+      <w:pPr>
+        <w:numPr>
+          <w:ilvl w:val="0"/>
+          <w:numId w:val="27"/>
+        </w:numPr>
+      </w:pPr>
+      <w:r>
+        <w:t>Improve investor engagement in B30 regions.</w:t>
+      </w:r>
+    </w:p>
+    <w:p>
+      <w:pPr>
+        <w:numPr>
+          <w:ilvl w:val="0"/>
+          <w:numId w:val="27"/>
+        </w:numPr>
+      </w:pPr>
+      <w:r>
+        <w:t>Monitor SIP continuity to reduce churn.</w:t>
+      </w:r>
+    </w:p>
+    <w:p>
+      <w:pPr>
+        <w:numPr>
+          <w:ilvl w:val="0"/>
+          <w:numId w:val="27"/>
+        </w:numPr>
+      </w:pPr>
+      <w:r>
+        <w:t>Promote diversified investment strategies.</w:t>
+      </w:r>
+    </w:p>
+    <w:p>
+      <w:pPr>
+        <w:rPr>
+          <w:b/>
+          <w:bCs/>
+        </w:rPr>
+      </w:pPr>
+      <w:r>
+        <w:rPr>
+          <w:b/>
+          <w:bCs/>
+        </w:rPr>
+        <w:t>For Future Enhancements</w:t>
+      </w:r>
+    </w:p>
+    <w:p>
+      <w:pPr>
+        <w:numPr>
+          <w:ilvl w:val="0"/>
+          <w:numId w:val="28"/>
+        </w:numPr>
+      </w:pPr>
+      <w:r>
+        <w:t>Machine Learning-based recommendation engine.</w:t>
+      </w:r>
+    </w:p>
+    <w:p>
+      <w:pPr>
+        <w:numPr>
+          <w:ilvl w:val="0"/>
+          <w:numId w:val="28"/>
+        </w:numPr>
+      </w:pPr>
+      <w:r>
         <w:lastRenderedPageBreak/>
-        <w:t>11. Dashboard Overview</w:t>
-      </w:r>
-    </w:p>
-    <w:p>
-      <w:pPr>
-        <w:rPr>
-          <w:b/>
-          <w:bCs/>
-        </w:rPr>
-      </w:pPr>
-      <w:r>
-        <w:rPr>
-          <w:b/>
-          <w:bCs/>
-        </w:rPr>
-        <w:t>Dashboard Components</w:t>
-      </w:r>
-    </w:p>
-    <w:p>
-      <w:pPr>
-        <w:numPr>
-          <w:ilvl w:val="0"/>
-          <w:numId w:val="24"/>
-        </w:numPr>
-      </w:pPr>
-      <w:r>
-        <w:t>Executive Summary</w:t>
-      </w:r>
-    </w:p>
-    <w:p>
-      <w:pPr>
-        <w:numPr>
-          <w:ilvl w:val="0"/>
-          <w:numId w:val="24"/>
-        </w:numPr>
-      </w:pPr>
-      <w:r>
-        <w:t>Investor Analytics</w:t>
-      </w:r>
-    </w:p>
-    <w:p>
-      <w:pPr>
-        <w:numPr>
-          <w:ilvl w:val="0"/>
-          <w:numId w:val="24"/>
-        </w:numPr>
-      </w:pPr>
-      <w:r>
-        <w:t>Fund Performance</w:t>
-      </w:r>
-    </w:p>
-    <w:p>
-      <w:pPr>
-        <w:numPr>
-          <w:ilvl w:val="0"/>
-          <w:numId w:val="24"/>
-        </w:numPr>
-      </w:pPr>
-      <w:r>
-        <w:t>Risk Analytics</w:t>
-      </w:r>
-    </w:p>
-    <w:p>
-      <w:pPr>
-        <w:numPr>
-          <w:ilvl w:val="0"/>
-          <w:numId w:val="24"/>
-        </w:numPr>
-      </w:pPr>
-      <w:r>
-        <w:t>Portfolio Concentration</w:t>
-      </w:r>
-    </w:p>
-    <w:p>
-      <w:pPr>
-        <w:numPr>
-          <w:ilvl w:val="0"/>
-          <w:numId w:val="24"/>
-        </w:numPr>
-      </w:pPr>
-      <w:r>
-        <w:t>Geographic Analysis</w:t>
-      </w:r>
-    </w:p>
-    <w:p>
-      <w:r>
-        <w:t>(Insert Dashboard Screenshots)</w:t>
-      </w:r>
-    </w:p>
-    <w:p>
-      <w:r>
-        <w:t>Screenshot 1: Overview Dashboard</w:t>
-      </w:r>
-    </w:p>
-    <w:p/>
-    <w:p>
-      <w:r>
-        <w:t>Screenshot 2: Investor Analytics Dashboard</w:t>
-      </w:r>
-    </w:p>
-    <w:p/>
-    <w:p>
-      <w:r>
-        <w:t>Screenshot 3: Risk Analytics Dashboard</w:t>
-      </w:r>
-    </w:p>
-    <w:p>
-      <w:r>
-        <w:t>Screenshot 4: Fund Performance Dashboard</w:t>
-      </w:r>
-    </w:p>
-    <w:p>
-      <w:r>
-        <w:pict w14:anchorId="5084955F">
-          <v:rect id="_x0000_i1182" style="width:0;height:1.5pt" o:hralign="center" o:hrstd="t" o:hr="t" fillcolor="#a0a0a0" stroked="f"/>
-        </w:pict>
-      </w:r>
-    </w:p>
-    <w:p>
-      <w:pPr>
-        <w:rPr>
-          <w:b/>
-          <w:bCs/>
-        </w:rPr>
-      </w:pPr>
-      <w:r>
-        <w:rPr>
-          <w:b/>
-          <w:bCs/>
-        </w:rPr>
-        <w:t>12. Key Insights</w:t>
-      </w:r>
-    </w:p>
-    <w:p>
-      <w:pPr>
-        <w:rPr>
-          <w:b/>
-          <w:bCs/>
-        </w:rPr>
-      </w:pPr>
-      <w:r>
-        <w:rPr>
-          <w:b/>
-          <w:bCs/>
-        </w:rPr>
-        <w:t>Insight 1</w:t>
-      </w:r>
-    </w:p>
-    <w:p>
-      <w:r>
-        <w:t>Funds with the highest VaR values exhibited significantly larger downside exposure.</w:t>
-      </w:r>
-    </w:p>
-    <w:p>
-      <w:pPr>
-        <w:rPr>
-          <w:b/>
-          <w:bCs/>
-        </w:rPr>
-      </w:pPr>
-      <w:r>
-        <w:rPr>
-          <w:b/>
-          <w:bCs/>
-        </w:rPr>
-        <w:t>Insight 2</w:t>
-      </w:r>
-    </w:p>
-    <w:p>
-      <w:r>
-        <w:t>Recent investor cohorts contribute the largest investment volumes.</w:t>
-      </w:r>
-    </w:p>
-    <w:p>
-      <w:pPr>
-        <w:rPr>
-          <w:b/>
-          <w:bCs/>
-        </w:rPr>
-      </w:pPr>
-      <w:r>
-        <w:rPr>
-          <w:b/>
-          <w:bCs/>
-        </w:rPr>
-        <w:t>Insight 3</w:t>
-      </w:r>
-    </w:p>
-    <w:p>
-      <w:r>
-        <w:t>A small group of states account for the majority of SIP investments.</w:t>
-      </w:r>
-    </w:p>
-    <w:p>
-      <w:pPr>
-        <w:rPr>
-          <w:b/>
-          <w:bCs/>
-        </w:rPr>
-      </w:pPr>
-      <w:r>
-        <w:rPr>
-          <w:b/>
-          <w:bCs/>
-        </w:rPr>
-        <w:t>Insight 4</w:t>
-      </w:r>
-    </w:p>
-    <w:p>
-      <w:r>
-        <w:t>Higher Sharpe Ratio funds consistently outperform peers on a risk-adjusted basis.</w:t>
-      </w:r>
-    </w:p>
-    <w:p>
-      <w:pPr>
-        <w:rPr>
-          <w:b/>
-          <w:bCs/>
-        </w:rPr>
-      </w:pPr>
-      <w:r>
-        <w:rPr>
-          <w:b/>
-          <w:bCs/>
-        </w:rPr>
-        <w:t>Insight 5</w:t>
-      </w:r>
-    </w:p>
-    <w:p>
-      <w:r>
-        <w:t>Portfolio concentration varies significantly across equity schemes.</w:t>
-      </w:r>
-    </w:p>
-    <w:p>
-      <w:r>
-        <w:pict w14:anchorId="09634F08">
-          <v:rect id="_x0000_i1183" style="width:0;height:1.5pt" o:hralign="center" o:hrstd="t" o:hr="t" fillcolor="#a0a0a0" stroked="f"/>
-        </w:pict>
-      </w:r>
-    </w:p>
-    <w:p>
-      <w:pPr>
-        <w:rPr>
-          <w:b/>
-          <w:bCs/>
-        </w:rPr>
-      </w:pPr>
-      <w:r>
-        <w:rPr>
-          <w:b/>
-          <w:bCs/>
-        </w:rPr>
-        <w:t>13. Limitations</w:t>
-      </w:r>
-    </w:p>
-    <w:p>
-      <w:pPr>
-        <w:numPr>
-          <w:ilvl w:val="0"/>
-          <w:numId w:val="25"/>
-        </w:numPr>
-      </w:pPr>
-      <w:r>
-        <w:t>Historical performance does not guarantee future returns.</w:t>
-      </w:r>
-    </w:p>
-    <w:p>
-      <w:pPr>
-        <w:numPr>
-          <w:ilvl w:val="0"/>
-          <w:numId w:val="25"/>
-        </w:numPr>
-      </w:pPr>
-      <w:r>
-        <w:t>Limited availability of live market data.</w:t>
-      </w:r>
-    </w:p>
-    <w:p>
-      <w:pPr>
-        <w:numPr>
-          <w:ilvl w:val="0"/>
-          <w:numId w:val="25"/>
-        </w:numPr>
-      </w:pPr>
-      <w:r>
-        <w:lastRenderedPageBreak/>
-        <w:t>Simplified recommendation engine.</w:t>
-      </w:r>
-    </w:p>
-    <w:p>
-      <w:pPr>
-        <w:numPr>
-          <w:ilvl w:val="0"/>
-          <w:numId w:val="25"/>
-        </w:numPr>
-      </w:pPr>
-      <w:r>
-        <w:t>Assumed transaction consistency for SIP analysis.</w:t>
-      </w:r>
-    </w:p>
-    <w:p>
-      <w:pPr>
-        <w:numPr>
-          <w:ilvl w:val="0"/>
-          <w:numId w:val="25"/>
-        </w:numPr>
-      </w:pPr>
-      <w:r>
-        <w:t>Portfolio holdings snapshots may not represent real-time allocations.</w:t>
-      </w:r>
-    </w:p>
-    <w:p>
-      <w:r>
-        <w:pict w14:anchorId="41DBA080">
-          <v:rect id="_x0000_i1184" style="width:0;height:1.5pt" o:hralign="center" o:hrstd="t" o:hr="t" fillcolor="#a0a0a0" stroked="f"/>
-        </w:pict>
-      </w:r>
-    </w:p>
-    <w:p>
-      <w:pPr>
-        <w:rPr>
-          <w:b/>
-          <w:bCs/>
-        </w:rPr>
-      </w:pPr>
-      <w:r>
-        <w:rPr>
-          <w:b/>
-          <w:bCs/>
-        </w:rPr>
-        <w:t>14. Recommendations</w:t>
-      </w:r>
-    </w:p>
-    <w:p>
-      <w:pPr>
-        <w:rPr>
-          <w:b/>
-          <w:bCs/>
-        </w:rPr>
-      </w:pPr>
-      <w:r>
-        <w:rPr>
-          <w:b/>
-          <w:bCs/>
-        </w:rPr>
-        <w:t>For Investors</w:t>
-      </w:r>
-    </w:p>
-    <w:p>
-      <w:pPr>
-        <w:numPr>
-          <w:ilvl w:val="0"/>
-          <w:numId w:val="26"/>
-        </w:numPr>
-      </w:pPr>
-      <w:r>
-        <w:t>Focus on risk-adjusted returns rather than absolute returns.</w:t>
-      </w:r>
-    </w:p>
-    <w:p>
-      <w:pPr>
-        <w:numPr>
-          <w:ilvl w:val="0"/>
-          <w:numId w:val="26"/>
-        </w:numPr>
-      </w:pPr>
-      <w:r>
-        <w:t>Maintain SIP discipline for long-term wealth creation.</w:t>
-      </w:r>
-    </w:p>
-    <w:p>
-      <w:pPr>
-        <w:numPr>
-          <w:ilvl w:val="0"/>
-          <w:numId w:val="26"/>
-        </w:numPr>
-      </w:pPr>
-      <w:r>
-        <w:t>Diversify across categories and sectors.</w:t>
-      </w:r>
-    </w:p>
-    <w:p>
-      <w:pPr>
-        <w:rPr>
-          <w:b/>
-          <w:bCs/>
-        </w:rPr>
-      </w:pPr>
-      <w:r>
-        <w:rPr>
-          <w:b/>
-          <w:bCs/>
-        </w:rPr>
-        <w:t>For Fund Houses</w:t>
-      </w:r>
-    </w:p>
-    <w:p>
-      <w:pPr>
-        <w:numPr>
-          <w:ilvl w:val="0"/>
-          <w:numId w:val="27"/>
-        </w:numPr>
-      </w:pPr>
-      <w:r>
-        <w:t>Improve investor engagement in B30 regions.</w:t>
-      </w:r>
-    </w:p>
-    <w:p>
-      <w:pPr>
-        <w:numPr>
-          <w:ilvl w:val="0"/>
-          <w:numId w:val="27"/>
-        </w:numPr>
-      </w:pPr>
-      <w:r>
-        <w:t>Monitor SIP continuity to reduce churn.</w:t>
-      </w:r>
-    </w:p>
-    <w:p>
-      <w:pPr>
-        <w:numPr>
-          <w:ilvl w:val="0"/>
-          <w:numId w:val="27"/>
-        </w:numPr>
-      </w:pPr>
-      <w:r>
-        <w:t>Promote diversified investment strategies.</w:t>
-      </w:r>
-    </w:p>
-    <w:p>
-      <w:pPr>
-        <w:rPr>
-          <w:b/>
-          <w:bCs/>
-        </w:rPr>
-      </w:pPr>
-      <w:r>
-        <w:rPr>
-          <w:b/>
-          <w:bCs/>
-        </w:rPr>
-        <w:t>For Future Enhancements</w:t>
+        <w:t>Real-time NAV integration.</w:t>
       </w:r>
     </w:p>
     <w:p>
@@ -3134,7 +3336,7 @@
         </w:numPr>
       </w:pPr>
       <w:r>
-        <w:t>Machine Learning-based recommendation engine.</w:t>
+        <w:t>Portfolio optimization models.</w:t>
       </w:r>
     </w:p>
     <w:p>
@@ -3145,7 +3347,7 @@
         </w:numPr>
       </w:pPr>
       <w:r>
-        <w:t>Real-time NAV integration.</w:t>
+        <w:t>Predictive investor churn analytics.</w:t>
       </w:r>
     </w:p>
     <w:p>
@@ -3156,35 +3358,13 @@
         </w:numPr>
       </w:pPr>
       <w:r>
-        <w:t>Portfolio optimization models.</w:t>
-      </w:r>
-    </w:p>
-    <w:p>
-      <w:pPr>
-        <w:numPr>
-          <w:ilvl w:val="0"/>
-          <w:numId w:val="28"/>
-        </w:numPr>
-      </w:pPr>
-      <w:r>
-        <w:t>Predictive investor churn analytics.</w:t>
-      </w:r>
-    </w:p>
-    <w:p>
-      <w:pPr>
-        <w:numPr>
-          <w:ilvl w:val="0"/>
-          <w:numId w:val="28"/>
-        </w:numPr>
-      </w:pPr>
-      <w:r>
         <w:t>Automated dashboard refresh pipelines.</w:t>
       </w:r>
     </w:p>
     <w:p>
       <w:r>
         <w:pict w14:anchorId="21A929FD">
-          <v:rect id="_x0000_i1185" style="width:0;height:1.5pt" o:hralign="center" o:hrstd="t" o:hr="t" fillcolor="#a0a0a0" stroked="f"/>
+          <v:rect id="_x0000_i1047" style="width:0;height:1.5pt" o:hralign="center" o:hrstd="t" o:hr="t" fillcolor="#a0a0a0" stroked="f"/>
         </w:pict>
       </w:r>
     </w:p>
@@ -3227,6 +3407,11 @@
 
 <file path=word/numbering.xml><?xml version="1.0" encoding="utf-8"?>
 <w:numbering xmlns:wpc="http://schemas.microsoft.com/office/word/2010/wordprocessingCanvas" xmlns:cx="http://schemas.microsoft.com/office/drawing/2014/chartex" xmlns:cx1="http://schemas.microsoft.com/office/drawing/2015/9/8/chartex" xmlns:cx2="http://schemas.microsoft.com/office/drawing/2015/10/21/chartex" xmlns:cx3="http://schemas.microsoft.com/office/drawing/2016/5/9/chartex" xmlns:cx4="http://schemas.microsoft.com/office/drawing/2016/5/10/chartex" xmlns:cx5="http://schemas.microsoft.com/office/drawing/2016/5/11/chartex" xmlns:cx6="http://schemas.microsoft.com/office/drawing/2016/5/12/chartex" xmlns:cx7="http://schemas.microsoft.com/office/drawing/2016/5/13/chartex" xmlns:cx8="http://schemas.microsoft.com/office/drawing/2016/5/14/chartex" xmlns:mc="http://schemas.openxmlformats.org/markup-compatibility/2006" xmlns:aink="http://schemas.microsoft.com/office/drawing/2016/ink" xmlns:am3d="http://schemas.microsoft.com/office/drawing/2017/model3d" xmlns:o="urn:schemas-microsoft-com:office:office" xmlns:oel="http://schemas.microsoft.com/office/2019/extlst" xmlns:r="http://schemas.openxmlformats.org/officeDocument/2006/relationships" xmlns:m="http://schemas.openxmlformats.org/officeDocument/2006/math" xmlns:v="urn:schemas-microsoft-com:vml" xmlns:wp14="http://schemas.microsoft.com/office/word/2010/wordprocessingDrawing" xmlns:wp="http://schemas.openxmlformats.org/drawingml/2006/wordprocessingDrawing" xmlns:w10="urn:schemas-microsoft-com:office:word" xmlns:w="http://schemas.openxmlformats.org/wordprocessingml/2006/main" xmlns:w14="http://schemas.microsoft.com/office/word/2010/wordml" xmlns:w15="http://schemas.microsoft.com/office/word/2012/wordml" xmlns:w16cex="http://schemas.microsoft.com/office/word/2018/wordml/cex" xmlns:w16cid="http://schemas.microsoft.com/office/word/2016/wordml/cid" xmlns:w16="http://schemas.microsoft.com/office/word/2018/wordml" xmlns:w16du="http://schemas.microsoft.com/office/word/2023/wordml/word16du" xmlns:w16sdtdh="http://schemas.microsoft.com/office/word/2020/wordml/sdtdatahash" xmlns:w16sdtfl="http://schemas.microsoft.com/office/word/2024/wordml/sdtformatlock" xmlns:w16se="http://schemas.microsoft.com/office/word/2015/wordml/symex" xmlns:wpg="http://schemas.microsoft.com/office/word/2010/wordprocessingGroup" xmlns:wpi="http://schemas.microsoft.com/office/word/2010/wordprocessingInk" xmlns:wne="http://schemas.microsoft.com/office/word/2006/wordml" xmlns:wps="http://schemas.microsoft.com/office/word/2010/wordprocessingShape" mc:Ignorable="w14 w15 w16se w16cid w16 w16cex w16sdtdh w16sdtfl w16du wp14">
+  <w:numPicBullet w:numPicBulletId="0">
+    <w:pict>
+      <v:rect id="_x0000_i1025" style="width:0;height:1.5pt" o:hralign="center" o:bullet="t" o:hrstd="t" o:hr="t" fillcolor="#a0a0a0" stroked="f"/>
+    </w:pict>
+  </w:numPicBullet>
   <w:abstractNum w:abstractNumId="0" w15:restartNumberingAfterBreak="0">
     <w:nsid w:val="03603131"/>
     <w:multiLevelType w:val="multilevel"/>
@@ -6506,6 +6691,147 @@
     </w:lvl>
   </w:abstractNum>
   <w:abstractNum w:abstractNumId="22" w15:restartNumberingAfterBreak="0">
+    <w:nsid w:val="62A23CFE"/>
+    <w:multiLevelType w:val="hybridMultilevel"/>
+    <w:tmpl w:val="454E3CC0"/>
+    <w:lvl w:ilvl="0" w:tplc="E97E0F64">
+      <w:start w:val="1"/>
+      <w:numFmt w:val="bullet"/>
+      <w:lvlText w:val=""/>
+      <w:lvlPicBulletId w:val="0"/>
+      <w:lvlJc w:val="left"/>
+      <w:pPr>
+        <w:tabs>
+          <w:tab w:val="num" w:pos="720"/>
+        </w:tabs>
+        <w:ind w:left="720" w:hanging="360"/>
+      </w:pPr>
+      <w:rPr>
+        <w:rFonts w:ascii="Symbol" w:hAnsi="Symbol" w:hint="default"/>
+      </w:rPr>
+    </w:lvl>
+    <w:lvl w:ilvl="1" w:tplc="CB76E0F4" w:tentative="1">
+      <w:start w:val="1"/>
+      <w:numFmt w:val="bullet"/>
+      <w:lvlText w:val=""/>
+      <w:lvlJc w:val="left"/>
+      <w:pPr>
+        <w:tabs>
+          <w:tab w:val="num" w:pos="1440"/>
+        </w:tabs>
+        <w:ind w:left="1440" w:hanging="360"/>
+      </w:pPr>
+      <w:rPr>
+        <w:rFonts w:ascii="Symbol" w:hAnsi="Symbol" w:hint="default"/>
+      </w:rPr>
+    </w:lvl>
+    <w:lvl w:ilvl="2" w:tplc="A128F3F4" w:tentative="1">
+      <w:start w:val="1"/>
+      <w:numFmt w:val="bullet"/>
+      <w:lvlText w:val=""/>
+      <w:lvlJc w:val="left"/>
+      <w:pPr>
+        <w:tabs>
+          <w:tab w:val="num" w:pos="2160"/>
+        </w:tabs>
+        <w:ind w:left="2160" w:hanging="360"/>
+      </w:pPr>
+      <w:rPr>
+        <w:rFonts w:ascii="Symbol" w:hAnsi="Symbol" w:hint="default"/>
+      </w:rPr>
+    </w:lvl>
+    <w:lvl w:ilvl="3" w:tplc="940895EC" w:tentative="1">
+      <w:start w:val="1"/>
+      <w:numFmt w:val="bullet"/>
+      <w:lvlText w:val=""/>
+      <w:lvlJc w:val="left"/>
+      <w:pPr>
+        <w:tabs>
+          <w:tab w:val="num" w:pos="2880"/>
+        </w:tabs>
+        <w:ind w:left="2880" w:hanging="360"/>
+      </w:pPr>
+      <w:rPr>
+        <w:rFonts w:ascii="Symbol" w:hAnsi="Symbol" w:hint="default"/>
+      </w:rPr>
+    </w:lvl>
+    <w:lvl w:ilvl="4" w:tplc="277667AA" w:tentative="1">
+      <w:start w:val="1"/>
+      <w:numFmt w:val="bullet"/>
+      <w:lvlText w:val=""/>
+      <w:lvlJc w:val="left"/>
+      <w:pPr>
+        <w:tabs>
+          <w:tab w:val="num" w:pos="3600"/>
+        </w:tabs>
+        <w:ind w:left="3600" w:hanging="360"/>
+      </w:pPr>
+      <w:rPr>
+        <w:rFonts w:ascii="Symbol" w:hAnsi="Symbol" w:hint="default"/>
+      </w:rPr>
+    </w:lvl>
+    <w:lvl w:ilvl="5" w:tplc="64A46328" w:tentative="1">
+      <w:start w:val="1"/>
+      <w:numFmt w:val="bullet"/>
+      <w:lvlText w:val=""/>
+      <w:lvlJc w:val="left"/>
+      <w:pPr>
+        <w:tabs>
+          <w:tab w:val="num" w:pos="4320"/>
+        </w:tabs>
+        <w:ind w:left="4320" w:hanging="360"/>
+      </w:pPr>
+      <w:rPr>
+        <w:rFonts w:ascii="Symbol" w:hAnsi="Symbol" w:hint="default"/>
+      </w:rPr>
+    </w:lvl>
+    <w:lvl w:ilvl="6" w:tplc="5B962014" w:tentative="1">
+      <w:start w:val="1"/>
+      <w:numFmt w:val="bullet"/>
+      <w:lvlText w:val=""/>
+      <w:lvlJc w:val="left"/>
+      <w:pPr>
+        <w:tabs>
+          <w:tab w:val="num" w:pos="5040"/>
+        </w:tabs>
+        <w:ind w:left="5040" w:hanging="360"/>
+      </w:pPr>
+      <w:rPr>
+        <w:rFonts w:ascii="Symbol" w:hAnsi="Symbol" w:hint="default"/>
+      </w:rPr>
+    </w:lvl>
+    <w:lvl w:ilvl="7" w:tplc="1B0871D0" w:tentative="1">
+      <w:start w:val="1"/>
+      <w:numFmt w:val="bullet"/>
+      <w:lvlText w:val=""/>
+      <w:lvlJc w:val="left"/>
+      <w:pPr>
+        <w:tabs>
+          <w:tab w:val="num" w:pos="5760"/>
+        </w:tabs>
+        <w:ind w:left="5760" w:hanging="360"/>
+      </w:pPr>
+      <w:rPr>
+        <w:rFonts w:ascii="Symbol" w:hAnsi="Symbol" w:hint="default"/>
+      </w:rPr>
+    </w:lvl>
+    <w:lvl w:ilvl="8" w:tplc="BA664C36" w:tentative="1">
+      <w:start w:val="1"/>
+      <w:numFmt w:val="bullet"/>
+      <w:lvlText w:val=""/>
+      <w:lvlJc w:val="left"/>
+      <w:pPr>
+        <w:tabs>
+          <w:tab w:val="num" w:pos="6480"/>
+        </w:tabs>
+        <w:ind w:left="6480" w:hanging="360"/>
+      </w:pPr>
+      <w:rPr>
+        <w:rFonts w:ascii="Symbol" w:hAnsi="Symbol" w:hint="default"/>
+      </w:rPr>
+    </w:lvl>
+  </w:abstractNum>
+  <w:abstractNum w:abstractNumId="23" w15:restartNumberingAfterBreak="0">
     <w:nsid w:val="69083797"/>
     <w:multiLevelType w:val="multilevel"/>
     <w:tmpl w:val="D8DE59B0"/>
@@ -6654,7 +6980,7 @@
       </w:rPr>
     </w:lvl>
   </w:abstractNum>
-  <w:abstractNum w:abstractNumId="23" w15:restartNumberingAfterBreak="0">
+  <w:abstractNum w:abstractNumId="24" w15:restartNumberingAfterBreak="0">
     <w:nsid w:val="6DCE4BB6"/>
     <w:multiLevelType w:val="multilevel"/>
     <w:tmpl w:val="A8A67B70"/>
@@ -6803,7 +7129,7 @@
       </w:rPr>
     </w:lvl>
   </w:abstractNum>
-  <w:abstractNum w:abstractNumId="24" w15:restartNumberingAfterBreak="0">
+  <w:abstractNum w:abstractNumId="25" w15:restartNumberingAfterBreak="0">
     <w:nsid w:val="706C3618"/>
     <w:multiLevelType w:val="multilevel"/>
     <w:tmpl w:val="0F1E7316"/>
@@ -6952,7 +7278,7 @@
       </w:rPr>
     </w:lvl>
   </w:abstractNum>
-  <w:abstractNum w:abstractNumId="25" w15:restartNumberingAfterBreak="0">
+  <w:abstractNum w:abstractNumId="26" w15:restartNumberingAfterBreak="0">
     <w:nsid w:val="75755861"/>
     <w:multiLevelType w:val="multilevel"/>
     <w:tmpl w:val="B1629B78"/>
@@ -7101,7 +7427,7 @@
       </w:rPr>
     </w:lvl>
   </w:abstractNum>
-  <w:abstractNum w:abstractNumId="26" w15:restartNumberingAfterBreak="0">
+  <w:abstractNum w:abstractNumId="27" w15:restartNumberingAfterBreak="0">
     <w:nsid w:val="76EA5240"/>
     <w:multiLevelType w:val="multilevel"/>
     <w:tmpl w:val="4AC8423C"/>
@@ -7250,7 +7576,7 @@
       </w:rPr>
     </w:lvl>
   </w:abstractNum>
-  <w:abstractNum w:abstractNumId="27" w15:restartNumberingAfterBreak="0">
+  <w:abstractNum w:abstractNumId="28" w15:restartNumberingAfterBreak="0">
     <w:nsid w:val="7D712839"/>
     <w:multiLevelType w:val="multilevel"/>
     <w:tmpl w:val="75303CEC"/>
@@ -7421,7 +7747,7 @@
     <w:abstractNumId w:val="3"/>
   </w:num>
   <w:num w:numId="8" w16cid:durableId="1684749242">
-    <w:abstractNumId w:val="25"/>
+    <w:abstractNumId w:val="26"/>
   </w:num>
   <w:num w:numId="9" w16cid:durableId="1754349666">
     <w:abstractNumId w:val="12"/>
@@ -7430,16 +7756,16 @@
     <w:abstractNumId w:val="14"/>
   </w:num>
   <w:num w:numId="11" w16cid:durableId="456994288">
-    <w:abstractNumId w:val="22"/>
+    <w:abstractNumId w:val="23"/>
   </w:num>
   <w:num w:numId="12" w16cid:durableId="1507936597">
-    <w:abstractNumId w:val="27"/>
+    <w:abstractNumId w:val="28"/>
   </w:num>
   <w:num w:numId="13" w16cid:durableId="1498185685">
     <w:abstractNumId w:val="4"/>
   </w:num>
   <w:num w:numId="14" w16cid:durableId="1799226531">
-    <w:abstractNumId w:val="23"/>
+    <w:abstractNumId w:val="24"/>
   </w:num>
   <w:num w:numId="15" w16cid:durableId="899366764">
     <w:abstractNumId w:val="2"/>
@@ -7472,16 +7798,19 @@
     <w:abstractNumId w:val="9"/>
   </w:num>
   <w:num w:numId="25" w16cid:durableId="1192720579">
-    <w:abstractNumId w:val="26"/>
+    <w:abstractNumId w:val="27"/>
   </w:num>
   <w:num w:numId="26" w16cid:durableId="1042510915">
     <w:abstractNumId w:val="13"/>
   </w:num>
   <w:num w:numId="27" w16cid:durableId="1236205819">
-    <w:abstractNumId w:val="24"/>
+    <w:abstractNumId w:val="25"/>
   </w:num>
   <w:num w:numId="28" w16cid:durableId="582688348">
     <w:abstractNumId w:val="21"/>
+  </w:num>
+  <w:num w:numId="29" w16cid:durableId="206114386">
+    <w:abstractNumId w:val="22"/>
   </w:num>
 </w:numbering>
 </file>
@@ -8089,6 +8418,7 @@
   <w:style w:type="character" w:default="1" w:styleId="DefaultParagraphFont">
     <w:name w:val="Default Paragraph Font"/>
     <w:uiPriority w:val="1"/>
+    <w:semiHidden/>
     <w:unhideWhenUsed/>
   </w:style>
   <w:style w:type="table" w:default="1" w:styleId="TableNormal">

</xml_diff>